<commit_message>
Version final entregado al usuario
</commit_message>
<xml_diff>
--- a/Manual de usuario.docx
+++ b/Manual de usuario.docx
@@ -58,13 +58,12 @@
         <w:rPr>
           <w:b/>
           <w:bCs/>
-          <w:noProof/>
         </w:rPr>
         <w:drawing>
-          <wp:inline distT="0" distB="0" distL="0" distR="0" wp14:anchorId="3E823FDB" wp14:editId="25D88C87">
-            <wp:extent cx="5344271" cy="3115110"/>
-            <wp:effectExtent l="0" t="0" r="8890" b="9525"/>
-            <wp:docPr id="141974481" name="Imagen 1"/>
+          <wp:inline distT="0" distB="0" distL="0" distR="0" wp14:anchorId="53D379D8" wp14:editId="72F637B8">
+            <wp:extent cx="4915586" cy="6287377"/>
+            <wp:effectExtent l="0" t="0" r="0" b="0"/>
+            <wp:docPr id="1006551321" name="Imagen 1"/>
             <wp:cNvGraphicFramePr>
               <a:graphicFrameLocks xmlns:a="http://schemas.openxmlformats.org/drawingml/2006/main" noChangeAspect="1"/>
             </wp:cNvGraphicFramePr>
@@ -72,7 +71,7 @@
               <a:graphicData uri="http://schemas.openxmlformats.org/drawingml/2006/picture">
                 <pic:pic xmlns:pic="http://schemas.openxmlformats.org/drawingml/2006/picture">
                   <pic:nvPicPr>
-                    <pic:cNvPr id="141974481" name=""/>
+                    <pic:cNvPr id="1006551321" name=""/>
                     <pic:cNvPicPr/>
                   </pic:nvPicPr>
                   <pic:blipFill>
@@ -84,7 +83,7 @@
                   <pic:spPr>
                     <a:xfrm>
                       <a:off x="0" y="0"/>
-                      <a:ext cx="5344271" cy="3115110"/>
+                      <a:ext cx="4915586" cy="6287377"/>
                     </a:xfrm>
                     <a:prstGeom prst="rect">
                       <a:avLst/>
@@ -195,13 +194,12 @@
         <w:rPr>
           <w:b/>
           <w:bCs/>
-          <w:noProof/>
         </w:rPr>
         <w:drawing>
-          <wp:inline distT="0" distB="0" distL="0" distR="0" wp14:anchorId="1645DE87" wp14:editId="117691C0">
-            <wp:extent cx="5287113" cy="3134162"/>
-            <wp:effectExtent l="0" t="0" r="8890" b="9525"/>
-            <wp:docPr id="1169621645" name="Imagen 1"/>
+          <wp:inline distT="0" distB="0" distL="0" distR="0" wp14:anchorId="3CD3C3D0" wp14:editId="230BE625">
+            <wp:extent cx="4972744" cy="6373114"/>
+            <wp:effectExtent l="0" t="0" r="0" b="8890"/>
+            <wp:docPr id="550060267" name="Imagen 1"/>
             <wp:cNvGraphicFramePr>
               <a:graphicFrameLocks xmlns:a="http://schemas.openxmlformats.org/drawingml/2006/main" noChangeAspect="1"/>
             </wp:cNvGraphicFramePr>
@@ -209,7 +207,7 @@
               <a:graphicData uri="http://schemas.openxmlformats.org/drawingml/2006/picture">
                 <pic:pic xmlns:pic="http://schemas.openxmlformats.org/drawingml/2006/picture">
                   <pic:nvPicPr>
-                    <pic:cNvPr id="1169621645" name=""/>
+                    <pic:cNvPr id="550060267" name=""/>
                     <pic:cNvPicPr/>
                   </pic:nvPicPr>
                   <pic:blipFill>
@@ -221,7 +219,7 @@
                   <pic:spPr>
                     <a:xfrm>
                       <a:off x="0" y="0"/>
-                      <a:ext cx="5287113" cy="3134162"/>
+                      <a:ext cx="4972744" cy="6373114"/>
                     </a:xfrm>
                     <a:prstGeom prst="rect">
                       <a:avLst/>
@@ -246,19 +244,18 @@
           <w:b/>
           <w:bCs/>
         </w:rPr>
-        <w:t xml:space="preserve">Debe dar clic en </w:t>
-      </w:r>
-      <w:r>
-        <w:rPr>
-          <w:b/>
-          <w:bCs/>
-          <w:noProof/>
+        <w:t>Debe dar clic en</w:t>
+      </w:r>
+      <w:r>
+        <w:rPr>
+          <w:b/>
+          <w:bCs/>
         </w:rPr>
         <w:drawing>
-          <wp:inline distT="0" distB="0" distL="0" distR="0" wp14:anchorId="0CC228C7" wp14:editId="0FA30C59">
-            <wp:extent cx="1790950" cy="342948"/>
+          <wp:inline distT="0" distB="0" distL="0" distR="0" wp14:anchorId="21004E82" wp14:editId="0A0A906C">
+            <wp:extent cx="2785731" cy="390525"/>
             <wp:effectExtent l="0" t="0" r="0" b="0"/>
-            <wp:docPr id="1092887638" name="Imagen 1"/>
+            <wp:docPr id="799486610" name="Imagen 1"/>
             <wp:cNvGraphicFramePr>
               <a:graphicFrameLocks xmlns:a="http://schemas.openxmlformats.org/drawingml/2006/main" noChangeAspect="1"/>
             </wp:cNvGraphicFramePr>
@@ -266,7 +263,7 @@
               <a:graphicData uri="http://schemas.openxmlformats.org/drawingml/2006/picture">
                 <pic:pic xmlns:pic="http://schemas.openxmlformats.org/drawingml/2006/picture">
                   <pic:nvPicPr>
-                    <pic:cNvPr id="1092887638" name=""/>
+                    <pic:cNvPr id="799486610" name=""/>
                     <pic:cNvPicPr/>
                   </pic:nvPicPr>
                   <pic:blipFill>
@@ -278,7 +275,7 @@
                   <pic:spPr>
                     <a:xfrm>
                       <a:off x="0" y="0"/>
-                      <a:ext cx="1790950" cy="342948"/>
+                      <a:ext cx="2792489" cy="391472"/>
                     </a:xfrm>
                     <a:prstGeom prst="rect">
                       <a:avLst/>
@@ -295,7 +292,22 @@
           <w:b/>
           <w:bCs/>
         </w:rPr>
-        <w:t>,luego se empezará a ejecutar el proceso.</w:t>
+        <w:t>,</w:t>
+      </w:r>
+    </w:p>
+    <w:p>
+      <w:pPr>
+        <w:rPr>
+          <w:b/>
+          <w:bCs/>
+        </w:rPr>
+      </w:pPr>
+      <w:r>
+        <w:rPr>
+          <w:b/>
+          <w:bCs/>
+        </w:rPr>
+        <w:t>luego se empezará a ejecutar el proceso.</w:t>
       </w:r>
     </w:p>
     <w:p>
@@ -734,21 +746,21 @@
           <w:b/>
           <w:bCs/>
         </w:rPr>
-        <w:t>Se nombra el extracto mensual individual de la misma manera (</w:t>
-      </w:r>
-      <w:r>
-        <w:rPr>
-          <w:b/>
-          <w:bCs/>
-        </w:rPr>
-        <w:t>####_Razón social_Nombre del cliente</w:t>
-      </w:r>
-      <w:r>
-        <w:rPr>
-          <w:b/>
-          <w:bCs/>
-        </w:rPr>
-        <w:t>), y se inserta dentro de su respectiva carpeta, el archivo se guarda de la siguiente manera:</w:t>
+        <w:t>Se nombra el extracto mensual individua</w:t>
+      </w:r>
+      <w:r>
+        <w:rPr>
+          <w:b/>
+          <w:bCs/>
+        </w:rPr>
+        <w:t>l con los últimos cuatro dígitos de la tarjeta</w:t>
+      </w:r>
+      <w:r>
+        <w:rPr>
+          <w:b/>
+          <w:bCs/>
+        </w:rPr>
+        <w:t>, y se inserta dentro de su respectiva carpeta, el archivo se guarda de la siguiente manera:</w:t>
       </w:r>
     </w:p>
     <w:p>
@@ -767,10 +779,10 @@
           <w:noProof/>
         </w:rPr>
         <w:drawing>
-          <wp:inline distT="0" distB="0" distL="0" distR="0" wp14:anchorId="6CA605F0" wp14:editId="383EBEBA">
-            <wp:extent cx="5830114" cy="362001"/>
+          <wp:inline distT="0" distB="0" distL="0" distR="0" wp14:anchorId="59AE9548" wp14:editId="19A1DA34">
+            <wp:extent cx="6182588" cy="342948"/>
             <wp:effectExtent l="0" t="0" r="0" b="0"/>
-            <wp:docPr id="34798268" name="Imagen 1"/>
+            <wp:docPr id="230706756" name="Imagen 1"/>
             <wp:cNvGraphicFramePr>
               <a:graphicFrameLocks xmlns:a="http://schemas.openxmlformats.org/drawingml/2006/main" noChangeAspect="1"/>
             </wp:cNvGraphicFramePr>
@@ -778,7 +790,7 @@
               <a:graphicData uri="http://schemas.openxmlformats.org/drawingml/2006/picture">
                 <pic:pic xmlns:pic="http://schemas.openxmlformats.org/drawingml/2006/picture">
                   <pic:nvPicPr>
-                    <pic:cNvPr id="34798268" name=""/>
+                    <pic:cNvPr id="230706756" name=""/>
                     <pic:cNvPicPr/>
                   </pic:nvPicPr>
                   <pic:blipFill>
@@ -790,7 +802,7 @@
                   <pic:spPr>
                     <a:xfrm>
                       <a:off x="0" y="0"/>
-                      <a:ext cx="5830114" cy="362001"/>
+                      <a:ext cx="6182588" cy="342948"/>
                     </a:xfrm>
                     <a:prstGeom prst="rect">
                       <a:avLst/>
@@ -866,7 +878,14 @@
           <w:b/>
           <w:bCs/>
         </w:rPr>
-        <w:t>####_Razón social_Nombre del cliente</w:t>
+        <w:t>####</w:t>
+      </w:r>
+      <w:r>
+        <w:rPr>
+          <w:b/>
+          <w:bCs/>
+        </w:rPr>
+        <w:t>.pdf</w:t>
       </w:r>
       <w:r>
         <w:rPr>
@@ -892,10 +911,10 @@
           <w:noProof/>
         </w:rPr>
         <w:drawing>
-          <wp:inline distT="0" distB="0" distL="0" distR="0" wp14:anchorId="5A27A6D5" wp14:editId="3E381B3C">
-            <wp:extent cx="5782482" cy="543001"/>
+          <wp:inline distT="0" distB="0" distL="0" distR="0" wp14:anchorId="45304922" wp14:editId="687268A7">
+            <wp:extent cx="6420746" cy="714475"/>
             <wp:effectExtent l="0" t="0" r="0" b="9525"/>
-            <wp:docPr id="317725078" name="Imagen 1"/>
+            <wp:docPr id="1026500690" name="Imagen 1"/>
             <wp:cNvGraphicFramePr>
               <a:graphicFrameLocks xmlns:a="http://schemas.openxmlformats.org/drawingml/2006/main" noChangeAspect="1"/>
             </wp:cNvGraphicFramePr>
@@ -903,7 +922,7 @@
               <a:graphicData uri="http://schemas.openxmlformats.org/drawingml/2006/picture">
                 <pic:pic xmlns:pic="http://schemas.openxmlformats.org/drawingml/2006/picture">
                   <pic:nvPicPr>
-                    <pic:cNvPr id="317725078" name=""/>
+                    <pic:cNvPr id="1026500690" name=""/>
                     <pic:cNvPicPr/>
                   </pic:nvPicPr>
                   <pic:blipFill>
@@ -915,7 +934,7 @@
                   <pic:spPr>
                     <a:xfrm>
                       <a:off x="0" y="0"/>
-                      <a:ext cx="5782482" cy="543001"/>
+                      <a:ext cx="6420746" cy="714475"/>
                     </a:xfrm>
                     <a:prstGeom prst="rect">
                       <a:avLst/>
@@ -1351,24 +1370,15 @@
           <w:b/>
           <w:bCs/>
         </w:rPr>
-        <w:t xml:space="preserve">la hoja “Automatización </w:t>
-      </w:r>
-      <w:proofErr w:type="gramStart"/>
-      <w:r>
-        <w:rPr>
-          <w:b/>
-          <w:bCs/>
-        </w:rPr>
-        <w:t>envío</w:t>
-      </w:r>
-      <w:r>
-        <w:rPr>
-          <w:b/>
-          <w:bCs/>
-        </w:rPr>
-        <w:t>“ contiene</w:t>
-      </w:r>
-      <w:proofErr w:type="gramEnd"/>
+        <w:t>la hoja “Automatización envío</w:t>
+      </w:r>
+      <w:r>
+        <w:rPr>
+          <w:b/>
+          <w:bCs/>
+        </w:rPr>
+        <w:t xml:space="preserve"> “contiene</w:t>
+      </w:r>
       <w:r>
         <w:rPr>
           <w:b/>
@@ -1424,97 +1434,41 @@
           <w:bCs/>
         </w:rPr>
       </w:pPr>
-    </w:p>
-    <w:p>
-      <w:pPr>
-        <w:rPr>
-          <w:b/>
-          <w:bCs/>
-        </w:rPr>
-      </w:pPr>
-      <w:r>
-        <w:rPr>
-          <w:b/>
-          <w:bCs/>
-        </w:rPr>
-        <w:t>Al finalizar el proceso, se mostrarán las siguientes ventanas emergentes:</w:t>
-      </w:r>
-    </w:p>
-    <w:p>
-      <w:pPr>
-        <w:rPr>
-          <w:b/>
-          <w:bCs/>
-        </w:rPr>
-      </w:pPr>
-    </w:p>
-    <w:p>
-      <w:pPr>
-        <w:pStyle w:val="Prrafodelista"/>
-        <w:numPr>
-          <w:ilvl w:val="0"/>
-          <w:numId w:val="1"/>
-        </w:numPr>
-        <w:rPr>
-          <w:b/>
-          <w:bCs/>
-        </w:rPr>
-      </w:pPr>
-      <w:r>
-        <w:rPr>
-          <w:b/>
-          <w:bCs/>
-        </w:rPr>
-        <w:t xml:space="preserve">Si todo </w:t>
-      </w:r>
-      <w:r>
-        <w:rPr>
-          <w:b/>
-          <w:bCs/>
-        </w:rPr>
-        <w:t>se ejecutó correctamente:</w:t>
-      </w:r>
-    </w:p>
-    <w:p>
-      <w:pPr>
-        <w:pStyle w:val="Prrafodelista"/>
-        <w:numPr>
-          <w:ilvl w:val="0"/>
-          <w:numId w:val="10"/>
-        </w:numPr>
-        <w:rPr>
-          <w:b/>
-          <w:bCs/>
-        </w:rPr>
-      </w:pPr>
-      <w:r>
-        <w:rPr>
-          <w:b/>
-          <w:bCs/>
-        </w:rPr>
-        <w:t>se actualiza la interfaz:</w:t>
-      </w:r>
-    </w:p>
-    <w:p>
-      <w:pPr>
-        <w:pStyle w:val="Prrafodelista"/>
-        <w:ind w:firstLine="348"/>
-        <w:rPr>
-          <w:b/>
-          <w:bCs/>
-        </w:rPr>
-      </w:pPr>
-      <w:r>
-        <w:rPr>
-          <w:b/>
-          <w:bCs/>
-          <w:noProof/>
+      <w:r>
+        <w:rPr>
+          <w:b/>
+          <w:bCs/>
+        </w:rPr>
+        <w:t>Durante la ejecución del proceso, se muestra en tiempo real el progreso del sistema y el paso encuentra realizando en el instante</w:t>
+      </w:r>
+    </w:p>
+    <w:p>
+      <w:pPr>
+        <w:tabs>
+          <w:tab w:val="left" w:pos="1624"/>
+        </w:tabs>
+        <w:rPr>
+          <w:b/>
+          <w:bCs/>
+        </w:rPr>
+      </w:pPr>
+      <w:r>
+        <w:rPr>
+          <w:b/>
+          <w:bCs/>
+        </w:rPr>
+        <w:tab/>
+      </w:r>
+      <w:r>
+        <w:rPr>
+          <w:b/>
+          <w:bCs/>
         </w:rPr>
         <w:drawing>
-          <wp:inline distT="0" distB="0" distL="0" distR="0" wp14:anchorId="3456E164" wp14:editId="04118BE7">
-            <wp:extent cx="5296639" cy="3115110"/>
-            <wp:effectExtent l="0" t="0" r="0" b="9525"/>
-            <wp:docPr id="873242752" name="Imagen 1"/>
+          <wp:inline distT="0" distB="0" distL="0" distR="0" wp14:anchorId="5CD075E3" wp14:editId="444764EC">
+            <wp:extent cx="4820323" cy="6287377"/>
+            <wp:effectExtent l="0" t="0" r="0" b="0"/>
+            <wp:docPr id="1922737800" name="Imagen 1"/>
             <wp:cNvGraphicFramePr>
               <a:graphicFrameLocks xmlns:a="http://schemas.openxmlformats.org/drawingml/2006/main" noChangeAspect="1"/>
             </wp:cNvGraphicFramePr>
@@ -1522,7 +1476,7 @@
               <a:graphicData uri="http://schemas.openxmlformats.org/drawingml/2006/picture">
                 <pic:pic xmlns:pic="http://schemas.openxmlformats.org/drawingml/2006/picture">
                   <pic:nvPicPr>
-                    <pic:cNvPr id="873242752" name=""/>
+                    <pic:cNvPr id="1922737800" name=""/>
                     <pic:cNvPicPr/>
                   </pic:nvPicPr>
                   <pic:blipFill>
@@ -1534,7 +1488,137 @@
                   <pic:spPr>
                     <a:xfrm>
                       <a:off x="0" y="0"/>
-                      <a:ext cx="5296639" cy="3115110"/>
+                      <a:ext cx="4820323" cy="6287377"/>
+                    </a:xfrm>
+                    <a:prstGeom prst="rect">
+                      <a:avLst/>
+                    </a:prstGeom>
+                  </pic:spPr>
+                </pic:pic>
+              </a:graphicData>
+            </a:graphic>
+          </wp:inline>
+        </w:drawing>
+      </w:r>
+    </w:p>
+    <w:p>
+      <w:pPr>
+        <w:rPr>
+          <w:b/>
+          <w:bCs/>
+        </w:rPr>
+      </w:pPr>
+    </w:p>
+    <w:p>
+      <w:pPr>
+        <w:rPr>
+          <w:b/>
+          <w:bCs/>
+        </w:rPr>
+      </w:pPr>
+      <w:r>
+        <w:rPr>
+          <w:b/>
+          <w:bCs/>
+        </w:rPr>
+        <w:t>Al finalizar el proceso, se mostrarán las siguientes ventanas emergentes:</w:t>
+      </w:r>
+    </w:p>
+    <w:p>
+      <w:pPr>
+        <w:rPr>
+          <w:b/>
+          <w:bCs/>
+        </w:rPr>
+      </w:pPr>
+    </w:p>
+    <w:p>
+      <w:pPr>
+        <w:pStyle w:val="Prrafodelista"/>
+        <w:numPr>
+          <w:ilvl w:val="0"/>
+          <w:numId w:val="1"/>
+        </w:numPr>
+        <w:rPr>
+          <w:b/>
+          <w:bCs/>
+        </w:rPr>
+      </w:pPr>
+      <w:r>
+        <w:rPr>
+          <w:b/>
+          <w:bCs/>
+        </w:rPr>
+        <w:t xml:space="preserve">Si todo </w:t>
+      </w:r>
+      <w:r>
+        <w:rPr>
+          <w:b/>
+          <w:bCs/>
+        </w:rPr>
+        <w:t>se ejecutó correctamente:</w:t>
+      </w:r>
+    </w:p>
+    <w:p>
+      <w:pPr>
+        <w:pStyle w:val="Prrafodelista"/>
+        <w:numPr>
+          <w:ilvl w:val="0"/>
+          <w:numId w:val="10"/>
+        </w:numPr>
+        <w:rPr>
+          <w:b/>
+          <w:bCs/>
+        </w:rPr>
+      </w:pPr>
+      <w:r>
+        <w:rPr>
+          <w:b/>
+          <w:bCs/>
+        </w:rPr>
+        <w:t>se actualiza la interfaz:</w:t>
+      </w:r>
+    </w:p>
+    <w:p>
+      <w:pPr>
+        <w:pStyle w:val="Prrafodelista"/>
+        <w:ind w:firstLine="348"/>
+        <w:rPr>
+          <w:b/>
+          <w:bCs/>
+        </w:rPr>
+      </w:pPr>
+      <w:r>
+        <w:rPr>
+          <w:b/>
+          <w:bCs/>
+          <w:noProof/>
+        </w:rPr>
+        <w:drawing>
+          <wp:inline distT="0" distB="0" distL="0" distR="0" wp14:anchorId="2A6F51B2" wp14:editId="0B9DEEB6">
+            <wp:extent cx="4925112" cy="6335009"/>
+            <wp:effectExtent l="0" t="0" r="8890" b="8890"/>
+            <wp:docPr id="1232029774" name="Imagen 1"/>
+            <wp:cNvGraphicFramePr>
+              <a:graphicFrameLocks xmlns:a="http://schemas.openxmlformats.org/drawingml/2006/main" noChangeAspect="1"/>
+            </wp:cNvGraphicFramePr>
+            <a:graphic xmlns:a="http://schemas.openxmlformats.org/drawingml/2006/main">
+              <a:graphicData uri="http://schemas.openxmlformats.org/drawingml/2006/picture">
+                <pic:pic xmlns:pic="http://schemas.openxmlformats.org/drawingml/2006/picture">
+                  <pic:nvPicPr>
+                    <pic:cNvPr id="1232029774" name=""/>
+                    <pic:cNvPicPr/>
+                  </pic:nvPicPr>
+                  <pic:blipFill>
+                    <a:blip r:embed="rId17"/>
+                    <a:stretch>
+                      <a:fillRect/>
+                    </a:stretch>
+                  </pic:blipFill>
+                  <pic:spPr>
+                    <a:xfrm>
+                      <a:off x="0" y="0"/>
+                      <a:ext cx="4925112" cy="6335009"/>
                     </a:xfrm>
                     <a:prstGeom prst="rect">
                       <a:avLst/>
@@ -1608,7 +1692,7 @@
                     <pic:cNvPicPr/>
                   </pic:nvPicPr>
                   <pic:blipFill>
-                    <a:blip r:embed="rId17"/>
+                    <a:blip r:embed="rId18"/>
                     <a:stretch>
                       <a:fillRect/>
                     </a:stretch>
@@ -1690,7 +1774,7 @@
                     <pic:cNvPicPr/>
                   </pic:nvPicPr>
                   <pic:blipFill>
-                    <a:blip r:embed="rId18"/>
+                    <a:blip r:embed="rId19"/>
                     <a:stretch>
                       <a:fillRect/>
                     </a:stretch>
@@ -1758,7 +1842,21 @@
           <w:b/>
           <w:bCs/>
         </w:rPr>
-        <w:t>Se actualiza la interfaz gráfica:</w:t>
+        <w:t>Se actualiza la interfaz gráfica</w:t>
+      </w:r>
+      <w:r>
+        <w:rPr>
+          <w:b/>
+          <w:bCs/>
+        </w:rPr>
+        <w:t>, se indica el paso en el que ocurrió una excepción</w:t>
+      </w:r>
+      <w:r>
+        <w:rPr>
+          <w:b/>
+          <w:bCs/>
+        </w:rPr>
+        <w:t>:</w:t>
       </w:r>
     </w:p>
     <w:p>
@@ -1777,10 +1875,10 @@
           <w:noProof/>
         </w:rPr>
         <w:drawing>
-          <wp:inline distT="0" distB="0" distL="0" distR="0" wp14:anchorId="0D2F6DE4" wp14:editId="6F978876">
-            <wp:extent cx="5239481" cy="3086531"/>
-            <wp:effectExtent l="0" t="0" r="0" b="0"/>
-            <wp:docPr id="448055567" name="Imagen 1"/>
+          <wp:inline distT="0" distB="0" distL="0" distR="0" wp14:anchorId="0D515D5B" wp14:editId="057733C5">
+            <wp:extent cx="4848902" cy="6363588"/>
+            <wp:effectExtent l="0" t="0" r="8890" b="0"/>
+            <wp:docPr id="1814250892" name="Imagen 1"/>
             <wp:cNvGraphicFramePr>
               <a:graphicFrameLocks xmlns:a="http://schemas.openxmlformats.org/drawingml/2006/main" noChangeAspect="1"/>
             </wp:cNvGraphicFramePr>
@@ -1788,11 +1886,11 @@
               <a:graphicData uri="http://schemas.openxmlformats.org/drawingml/2006/picture">
                 <pic:pic xmlns:pic="http://schemas.openxmlformats.org/drawingml/2006/picture">
                   <pic:nvPicPr>
-                    <pic:cNvPr id="448055567" name=""/>
+                    <pic:cNvPr id="1814250892" name=""/>
                     <pic:cNvPicPr/>
                   </pic:nvPicPr>
                   <pic:blipFill>
-                    <a:blip r:embed="rId19"/>
+                    <a:blip r:embed="rId20"/>
                     <a:stretch>
                       <a:fillRect/>
                     </a:stretch>
@@ -1800,7 +1898,7 @@
                   <pic:spPr>
                     <a:xfrm>
                       <a:off x="0" y="0"/>
-                      <a:ext cx="5239481" cy="3086531"/>
+                      <a:ext cx="4848902" cy="6363588"/>
                     </a:xfrm>
                     <a:prstGeom prst="rect">
                       <a:avLst/>
@@ -1874,7 +1972,7 @@
                     <pic:cNvPicPr/>
                   </pic:nvPicPr>
                   <pic:blipFill>
-                    <a:blip r:embed="rId20"/>
+                    <a:blip r:embed="rId21"/>
                     <a:stretch>
                       <a:fillRect/>
                     </a:stretch>
@@ -1958,7 +2056,7 @@
                     <pic:cNvPicPr/>
                   </pic:nvPicPr>
                   <pic:blipFill>
-                    <a:blip r:embed="rId21"/>
+                    <a:blip r:embed="rId22"/>
                     <a:stretch>
                       <a:fillRect/>
                     </a:stretch>
@@ -2027,7 +2125,7 @@
                     <pic:cNvPicPr/>
                   </pic:nvPicPr>
                   <pic:blipFill>
-                    <a:blip r:embed="rId22"/>
+                    <a:blip r:embed="rId23"/>
                     <a:stretch>
                       <a:fillRect/>
                     </a:stretch>
@@ -2099,7 +2197,7 @@
                     <pic:cNvPicPr/>
                   </pic:nvPicPr>
                   <pic:blipFill>
-                    <a:blip r:embed="rId23"/>
+                    <a:blip r:embed="rId24"/>
                     <a:stretch>
                       <a:fillRect/>
                     </a:stretch>
@@ -2181,7 +2279,7 @@
                     <pic:cNvPicPr/>
                   </pic:nvPicPr>
                   <pic:blipFill>
-                    <a:blip r:embed="rId24"/>
+                    <a:blip r:embed="rId25"/>
                     <a:stretch>
                       <a:fillRect/>
                     </a:stretch>

</xml_diff>